<commit_message>
Cite release v2.3.0 (v2.1.0 and v2.2.0 were already published for earlier states)
Co-Authored-By: Claude Opus 5.5 <noreply@anthropic.com>
</commit_message>
<xml_diff>
--- a/manuscript/ILEDBV_Manuscript_Revised_v4_marked.docx
+++ b/manuscript/ILEDBV_Manuscript_Revised_v4_marked.docx
@@ -18721,7 +18721,6 @@
                 <w:kern w:val="0"/>
                 <w:sz w:val="17"/>
                 <w:szCs w:val="22"/>
-                <w:highlight w:val="yellow"/>
                 <w:lang w:val="en-US" w:eastAsia="en-US" w:bidi="ar-SA"/>
               </w:rPr>
               <w:t>Reagents costed explicitly</w:t>
@@ -18753,7 +18752,6 @@
                 <w:kern w:val="0"/>
                 <w:sz w:val="17"/>
                 <w:szCs w:val="22"/>
-                <w:highlight w:val="yellow"/>
                 <w:lang w:val="en-US" w:eastAsia="en-US" w:bidi="ar-SA"/>
               </w:rPr>
               <w:t>12.96</w:t>
@@ -19339,6 +19337,7 @@
                 <w:kern w:val="0"/>
                 <w:sz w:val="17"/>
                 <w:szCs w:val="22"/>
+                <w:highlight w:val="yellow"/>
                 <w:lang w:val="en-US" w:eastAsia="en-US" w:bidi="ar-SA"/>
               </w:rPr>
               <w:t>Swing ($ m-3)</w:t>
@@ -19577,7 +19576,6 @@
                 <w:kern w:val="0"/>
                 <w:sz w:val="17"/>
                 <w:szCs w:val="22"/>
-                <w:highlight w:val="yellow"/>
                 <w:lang w:val="en-US" w:eastAsia="en-US" w:bidi="ar-SA"/>
               </w:rPr>
               <w:t>sellable fraction, Mg(OH)2</w:t>
@@ -19677,7 +19675,6 @@
                 <w:kern w:val="0"/>
                 <w:sz w:val="17"/>
                 <w:szCs w:val="22"/>
-                <w:highlight w:val="yellow"/>
                 <w:lang w:val="en-US" w:eastAsia="en-US" w:bidi="ar-SA"/>
               </w:rPr>
               <w:t>Mg(OH)2 price</w:t>
@@ -21936,6 +21933,7 @@
             <w:r>
               <w:rPr>
                 <w:sz w:val="17"/>
+                <w:highlight w:val="yellow"/>
               </w:rPr>
               <w:t>Na2CO3 + purchased NaOH</w:t>
             </w:r>
@@ -22179,6 +22177,7 @@
             <w:r>
               <w:rPr>
                 <w:sz w:val="17"/>
+                <w:highlight w:val="yellow"/>
               </w:rPr>
               <w:t>Dosed CO2 + on-site NaOH (route D)</w:t>
             </w:r>
@@ -22300,6 +22299,7 @@
             <w:r>
               <w:rPr>
                 <w:sz w:val="17"/>
+                <w:highlight w:val="yellow"/>
               </w:rPr>
               <w:t>As written, then gypsum removal</w:t>
             </w:r>
@@ -22421,7 +22421,6 @@
             <w:r>
               <w:rPr>
                 <w:sz w:val="17"/>
-                <w:highlight w:val="yellow"/>
               </w:rPr>
               <w:t>Lime/NaOH blend + gypsum, dCa = 0</w:t>
             </w:r>
@@ -27342,7 +27341,7 @@
           <w:highlight w:val="yellow"/>
           <w:lang w:val="en-US"/>
         </w:rPr>
-        <w:t>The model implementation, the parameter set, the random seed, and the scripts that generate every table and figure are openly available at https://github.com/sandlerleon/iledbv-desalination-model, release tag v2.1.0.</w:t>
+        <w:t>The model implementation, the parameter set, the random seed, and the scripts that generate every table and figure are openly available at https://github.com/sandlerleon/iledbv-desalination-model, release tag v2.3.0.</w:t>
       </w:r>
       <w:r>
         <w:rPr>

</xml_diff>